<commit_message>
feat: complete phase 5 reports notifications communications and UI
</commit_message>
<xml_diff>
--- a/public/templates/notification-individual.docx
+++ b/public/templates/notification-individual.docx
@@ -8,737 +8,725 @@
         <w:jc w:val="center"/>
         <w:tblLayout w:type="fixed"/>
         <w:tblLook w:firstColumn="1" w:firstRow="1" w:lastColumn="0" w:lastRow="0" w:noHBand="0" w:noVBand="1" w:val="04A0"/>
-        <w:tblLayout w:type="fixed"/>
+        <w:tblBorders>
+          <w:top w:val="single" w:sz="5" w:color="777777"/>
+          <w:left w:val="single" w:sz="5" w:color="777777"/>
+          <w:bottom w:val="single" w:sz="5" w:color="777777"/>
+          <w:right w:val="single" w:sz="5" w:color="777777"/>
+          <w:insideH w:val="single" w:sz="5" w:color="777777"/>
+          <w:insideV w:val="single" w:sz="5" w:color="777777"/>
+        </w:tblBorders>
       </w:tblPr>
       <w:tblGrid>
-        <w:gridCol w:w="2835"/>
-        <w:gridCol w:w="2835"/>
-        <w:gridCol w:w="2835"/>
-        <w:gridCol w:w="2835"/>
+        <w:gridCol w:w="11452"/>
       </w:tblGrid>
       <w:tr>
         <w:trPr>
-          <w:trHeight w:val="368" w:hRule="atLeast"/>
+          <w:trHeight w:val="510" w:hRule="exact"/>
           <w:cantSplit/>
         </w:trPr>
         <w:tc>
           <w:tcPr>
-            <w:tcW w:type="dxa" w:w="5612"/>
-            <w:gridSpan w:val="2"/>
+            <w:tcW w:type="dxa" w:w="11452"/>
+            <w:tcMar>
+              <w:top w:w="34" w:type="dxa"/>
+              <w:start w:w="68" w:type="dxa"/>
+              <w:bottom w:w="22" w:type="dxa"/>
+              <w:end w:w="68" w:type="dxa"/>
+            </w:tcMar>
             <w:vAlign w:val="center"/>
+          </w:tcPr>
+          <w:tbl>
+            <w:tblPr>
+              <w:tblW w:type="auto" w:w="0"/>
+              <w:jc w:val="center"/>
+              <w:tblLayout w:type="fixed"/>
+              <w:tblLook w:firstColumn="1" w:firstRow="1" w:lastColumn="0" w:lastRow="0" w:noHBand="0" w:noVBand="1" w:val="04A0"/>
+            </w:tblPr>
+            <w:tblGrid>
+              <w:gridCol w:w="5726"/>
+              <w:gridCol w:w="5726"/>
+            </w:tblGrid>
+            <w:tr>
+              <w:tc>
+                <w:tcPr>
+                  <w:tcW w:type="dxa" w:w="8220"/>
+                  <w:tcMar>
+                    <w:top w:w="0" w:type="dxa"/>
+                    <w:start w:w="0" w:type="dxa"/>
+                    <w:bottom w:w="0" w:type="dxa"/>
+                    <w:end w:w="0" w:type="dxa"/>
+                  </w:tcMar>
+                  <w:vAlign w:val="center"/>
+                </w:tcPr>
+                <w:p>
+                  <w:pPr>
+                    <w:spacing w:before="0" w:after="0" w:line="240" w:lineRule="auto"/>
+                  </w:pPr>
+                  <w:r>
+                    <w:rPr>
+                      <w:rFonts w:ascii="Arial" w:hAnsi="Arial" w:eastAsia="Arial"/>
+                      <w:b w:val="0"/>
+                      <w:sz w:val="12"/>
+                    </w:rPr>
+                  </w:r>
+                  <w:r>
+                    <w:rPr>
+                      <w:rFonts w:ascii="Arial" w:hAnsi="Arial" w:eastAsia="Arial"/>
+                      <w:b w:val="0"/>
+                      <w:sz w:val="12"/>
+                    </w:rPr>
+                    <w:t>INSTITUCIÓN EDUCATIVA PRIVADA “NIKOLA TESLA”</w:t>
+                  </w:r>
+                  <w:r>
+                    <w:rPr>
+                      <w:rFonts w:ascii="Arial" w:hAnsi="Arial" w:eastAsia="Arial"/>
+                      <w:b w:val="0"/>
+                      <w:sz w:val="12"/>
+                    </w:rPr>
+                    <w:br/>
+                  </w:r>
+                  <w:r>
+                    <w:rPr>
+                      <w:rFonts w:ascii="Arial" w:hAnsi="Arial" w:eastAsia="Arial"/>
+                      <w:b w:val="0"/>
+                      <w:sz w:val="12"/>
+                    </w:rPr>
+                    <w:t>NOTIFICACIÓN SOBRE INCUMPLIMIENTO DE REGLAMENTO INTERNO DE LA INSTITUCIÓN</w:t>
+                  </w:r>
+                </w:p>
+              </w:tc>
+              <w:tc>
+                <w:tcPr>
+                  <w:tcW w:type="dxa" w:w="2777"/>
+                  <w:tcMar>
+                    <w:top w:w="0" w:type="dxa"/>
+                    <w:start w:w="0" w:type="dxa"/>
+                    <w:bottom w:w="0" w:type="dxa"/>
+                    <w:end w:w="0" w:type="dxa"/>
+                  </w:tcMar>
+                  <w:vAlign w:val="center"/>
+                </w:tcPr>
+                <w:p>
+                  <w:pPr>
+                    <w:spacing w:before="0" w:after="0" w:line="240" w:lineRule="auto"/>
+                    <w:jc w:val="right"/>
+                  </w:pPr>
+                  <w:r>
+                    <w:rPr>
+                      <w:rFonts w:ascii="Arial" w:hAnsi="Arial" w:eastAsia="Arial"/>
+                      <w:b w:val="0"/>
+                      <w:sz w:val="12"/>
+                    </w:rPr>
+                  </w:r>
+                  <w:r>
+                    <w:rPr>
+                      <w:rFonts w:ascii="Arial" w:hAnsi="Arial" w:eastAsia="Arial"/>
+                      <w:b w:val="0"/>
+                      <w:sz w:val="12"/>
+                    </w:rPr>
+                    <w:t>FECHA: {{date}}</w:t>
+                  </w:r>
+                  <w:r>
+                    <w:rPr>
+                      <w:rFonts w:ascii="Arial" w:hAnsi="Arial" w:eastAsia="Arial"/>
+                      <w:b w:val="0"/>
+                      <w:sz w:val="12"/>
+                    </w:rPr>
+                    <w:br/>
+                  </w:r>
+                  <w:r>
+                    <w:rPr>
+                      <w:rFonts w:ascii="Arial" w:hAnsi="Arial" w:eastAsia="Arial"/>
+                      <w:b w:val="0"/>
+                      <w:sz w:val="12"/>
+                    </w:rPr>
+                    <w:t>N° {{notificationNumber}}</w:t>
+                  </w:r>
+                </w:p>
+              </w:tc>
+            </w:tr>
+          </w:tbl>
+          <w:p/>
+        </w:tc>
+      </w:tr>
+      <w:tr>
+        <w:trPr>
+          <w:trHeight w:val="340" w:hRule="exact"/>
+          <w:cantSplit/>
+        </w:trPr>
+        <w:tc>
+          <w:tcPr>
+            <w:tcW w:type="dxa" w:w="11452"/>
             <w:tcMar>
-              <w:top w:w="35" w:type="dxa"/>
-              <w:bottom w:w="35" w:type="dxa"/>
-              <w:start w:w="55" w:type="dxa"/>
-              <w:end w:w="55" w:type="dxa"/>
+              <w:top w:w="34" w:type="dxa"/>
+              <w:start w:w="68" w:type="dxa"/>
+              <w:bottom w:w="22" w:type="dxa"/>
+              <w:end w:w="68" w:type="dxa"/>
             </w:tcMar>
-            <w:tcBorders>
-              <w:left w:val="single" w:sz="3" w:color="B8B8B8"/>
-              <w:right w:val="nil" w:sz="0" w:color="FFFFFF"/>
-              <w:top w:val="single" w:sz="3" w:color="B8B8B8"/>
-              <w:bottom w:val="nil" w:sz="0" w:color="FFFFFF"/>
-            </w:tcBorders>
+            <w:vAlign w:val="center"/>
+          </w:tcPr>
+          <w:tbl>
+            <w:tblPr>
+              <w:tblW w:type="auto" w:w="0"/>
+              <w:tblLayout w:type="fixed"/>
+              <w:tblLook w:firstColumn="1" w:firstRow="1" w:lastColumn="0" w:lastRow="0" w:noHBand="0" w:noVBand="1" w:val="04A0"/>
+            </w:tblPr>
+            <w:tblGrid>
+              <w:gridCol w:w="5726"/>
+              <w:gridCol w:w="5726"/>
+            </w:tblGrid>
+            <w:tr>
+              <w:tc>
+                <w:tcPr>
+                  <w:tcW w:type="dxa" w:w="7653"/>
+                  <w:tcMar>
+                    <w:top w:w="0" w:type="dxa"/>
+                    <w:start w:w="0" w:type="dxa"/>
+                    <w:bottom w:w="0" w:type="dxa"/>
+                    <w:end w:w="0" w:type="dxa"/>
+                  </w:tcMar>
+                </w:tcPr>
+                <w:p>
+                  <w:pPr>
+                    <w:spacing w:before="0" w:after="0" w:line="240" w:lineRule="auto"/>
+                  </w:pPr>
+                  <w:r>
+                    <w:rPr>
+                      <w:rFonts w:ascii="Arial" w:hAnsi="Arial" w:eastAsia="Arial"/>
+                      <w:b w:val="0"/>
+                      <w:sz w:val="12"/>
+                    </w:rPr>
+                  </w:r>
+                  <w:r>
+                    <w:rPr>
+                      <w:rFonts w:ascii="Arial" w:hAnsi="Arial" w:eastAsia="Arial"/>
+                      <w:b w:val="0"/>
+                      <w:sz w:val="12"/>
+                    </w:rPr>
+                    <w:t xml:space="preserve">ESTUDIANTE: </w:t>
+                  </w:r>
+                  <w:r>
+                    <w:rPr>
+                      <w:rFonts w:ascii="Arial" w:hAnsi="Arial" w:eastAsia="Arial"/>
+                      <w:b w:val="0"/>
+                      <w:sz w:val="12"/>
+                    </w:rPr>
+                    <w:t>{{studentName}}</w:t>
+                  </w:r>
+                </w:p>
+              </w:tc>
+              <w:tc>
+                <w:tcPr>
+                  <w:tcW w:type="dxa" w:w="3344"/>
+                  <w:tcMar>
+                    <w:top w:w="0" w:type="dxa"/>
+                    <w:start w:w="0" w:type="dxa"/>
+                    <w:bottom w:w="0" w:type="dxa"/>
+                    <w:end w:w="0" w:type="dxa"/>
+                  </w:tcMar>
+                </w:tcPr>
+                <w:p>
+                  <w:pPr>
+                    <w:spacing w:before="0" w:after="0" w:line="240" w:lineRule="auto"/>
+                    <w:jc w:val="right"/>
+                  </w:pPr>
+                  <w:r>
+                    <w:rPr>
+                      <w:rFonts w:ascii="Arial" w:hAnsi="Arial" w:eastAsia="Arial"/>
+                      <w:b w:val="0"/>
+                      <w:sz w:val="12"/>
+                    </w:rPr>
+                  </w:r>
+                  <w:r>
+                    <w:rPr>
+                      <w:rFonts w:ascii="Arial" w:hAnsi="Arial" w:eastAsia="Arial"/>
+                      <w:b w:val="0"/>
+                      <w:sz w:val="12"/>
+                    </w:rPr>
+                    <w:t xml:space="preserve">AÑO Y SECCIÓN: </w:t>
+                  </w:r>
+                  <w:r>
+                    <w:rPr>
+                      <w:rFonts w:ascii="Arial" w:hAnsi="Arial" w:eastAsia="Arial"/>
+                      <w:b w:val="0"/>
+                      <w:sz w:val="12"/>
+                    </w:rPr>
+                    <w:t>{{gradeSection}}</w:t>
+                  </w:r>
+                </w:p>
+              </w:tc>
+            </w:tr>
+          </w:tbl>
+          <w:p/>
+        </w:tc>
+      </w:tr>
+      <w:tr>
+        <w:trPr>
+          <w:trHeight w:val="340" w:hRule="exact"/>
+          <w:cantSplit/>
+        </w:trPr>
+        <w:tc>
+          <w:tcPr>
+            <w:tcW w:type="dxa" w:w="11452"/>
+            <w:tcMar>
+              <w:top w:w="34" w:type="dxa"/>
+              <w:start w:w="68" w:type="dxa"/>
+              <w:bottom w:w="22" w:type="dxa"/>
+              <w:end w:w="68" w:type="dxa"/>
+            </w:tcMar>
+            <w:vAlign w:val="center"/>
           </w:tcPr>
           <w:p>
             <w:pPr>
-              <w:spacing w:before="0" w:after="0" w:line="206" w:lineRule="auto"/>
+              <w:spacing w:before="0" w:after="0" w:line="240" w:lineRule="auto"/>
             </w:pPr>
-            <w:r/>
             <w:r>
               <w:rPr>
-                <w:rFonts w:ascii="Arial" w:hAnsi="Arial"/>
-                <w:b/>
-                <w:sz w:val="14"/>
+                <w:rFonts w:ascii="Arial" w:hAnsi="Arial" w:eastAsia="Arial"/>
+                <w:b w:val="0"/>
+                <w:sz w:val="12"/>
               </w:rPr>
-              <w:t>IEP “NIKOLA TESLA”</w:t>
             </w:r>
-          </w:p>
-        </w:tc>
-        <w:tc>
-          <w:tcPr>
-            <w:tcW w:type="dxa" w:w="5612"/>
-            <w:gridSpan w:val="2"/>
-            <w:vAlign w:val="center"/>
-            <w:tcMar>
-              <w:top w:w="35" w:type="dxa"/>
-              <w:bottom w:w="35" w:type="dxa"/>
-              <w:start w:w="55" w:type="dxa"/>
-              <w:end w:w="55" w:type="dxa"/>
-            </w:tcMar>
-            <w:tcBorders>
-              <w:left w:val="nil" w:sz="0" w:color="FFFFFF"/>
-              <w:right w:val="single" w:sz="3" w:color="B8B8B8"/>
-              <w:top w:val="single" w:sz="3" w:color="B8B8B8"/>
-              <w:bottom w:val="nil" w:sz="0" w:color="FFFFFF"/>
-            </w:tcBorders>
-          </w:tcPr>
-          <w:p>
-            <w:pPr>
-              <w:spacing w:before="0" w:after="0" w:line="206" w:lineRule="auto"/>
-              <w:jc w:val="right"/>
-            </w:pPr>
-            <w:r/>
             <w:r>
               <w:rPr>
-                <w:rFonts w:ascii="Arial" w:hAnsi="Arial"/>
-                <w:b/>
-                <w:sz w:val="14"/>
+                <w:rFonts w:ascii="Arial" w:hAnsi="Arial" w:eastAsia="Arial"/>
+                <w:b w:val="0"/>
+                <w:sz w:val="12"/>
               </w:rPr>
-              <w:t>NOTIFICACIÓN A PADRES DE FAMILIA</w:t>
+              <w:t xml:space="preserve">Por medio de la presente, se comunica al apoderado que el estudiante ha incurrido en un </w:t>
+            </w:r>
+            <w:r>
+              <w:rPr>
+                <w:rFonts w:ascii="Arial" w:hAnsi="Arial" w:eastAsia="Arial"/>
+                <w:b w:val="0"/>
+                <w:sz w:val="12"/>
+              </w:rPr>
+              <w:t>incumplimiento de las disposiciones institucionales</w:t>
+            </w:r>
+            <w:r>
+              <w:rPr>
+                <w:rFonts w:ascii="Arial" w:hAnsi="Arial" w:eastAsia="Arial"/>
+                <w:b w:val="0"/>
+                <w:sz w:val="12"/>
+              </w:rPr>
+              <w:t>, específicamente:</w:t>
             </w:r>
           </w:p>
         </w:tc>
       </w:tr>
       <w:tr>
         <w:trPr>
-          <w:trHeight w:val="226" w:hRule="atLeast"/>
+          <w:trHeight w:val="1587" w:hRule="exact"/>
           <w:cantSplit/>
         </w:trPr>
         <w:tc>
           <w:tcPr>
-            <w:tcW w:type="dxa" w:w="11224"/>
-            <w:gridSpan w:val="4"/>
+            <w:tcW w:type="dxa" w:w="11452"/>
+            <w:tcMar>
+              <w:top w:w="34" w:type="dxa"/>
+              <w:start w:w="68" w:type="dxa"/>
+              <w:bottom w:w="22" w:type="dxa"/>
+              <w:end w:w="68" w:type="dxa"/>
+            </w:tcMar>
             <w:vAlign w:val="center"/>
+          </w:tcPr>
+          <w:tbl>
+            <w:tblPr>
+              <w:tblW w:type="auto" w:w="0"/>
+              <w:tblLayout w:type="fixed"/>
+              <w:tblLook w:firstColumn="1" w:firstRow="1" w:lastColumn="0" w:lastRow="0" w:noHBand="0" w:noVBand="1" w:val="04A0"/>
+              <w:tblBorders>
+                <w:top w:val="single" w:sz="4" w:color="888888"/>
+                <w:left w:val="single" w:sz="4" w:color="888888"/>
+                <w:bottom w:val="single" w:sz="4" w:color="888888"/>
+                <w:right w:val="single" w:sz="4" w:color="888888"/>
+                <w:insideH w:val="single" w:sz="4" w:color="888888"/>
+                <w:insideV w:val="single" w:sz="4" w:color="888888"/>
+              </w:tblBorders>
+            </w:tblPr>
+            <w:tblGrid>
+              <w:gridCol w:w="5726"/>
+              <w:gridCol w:w="5726"/>
+            </w:tblGrid>
+            <w:tr>
+              <w:tc>
+                <w:tcPr>
+                  <w:tcW w:type="dxa" w:w="5215"/>
+                  <w:tcMar>
+                    <w:top w:w="45" w:type="dxa"/>
+                    <w:start w:w="73" w:type="dxa"/>
+                    <w:bottom w:w="28" w:type="dxa"/>
+                    <w:end w:w="73" w:type="dxa"/>
+                  </w:tcMar>
+                  <w:vAlign w:val="top"/>
+                </w:tcPr>
+                <w:p>
+                  <w:pPr>
+                    <w:spacing w:before="0" w:after="0" w:line="240" w:lineRule="auto"/>
+                  </w:pPr>
+                  <w:r>
+                    <w:rPr>
+                      <w:rFonts w:ascii="Arial" w:hAnsi="Arial" w:eastAsia="Arial"/>
+                      <w:b w:val="0"/>
+                      <w:sz w:val="12"/>
+                    </w:rPr>
+                  </w:r>
+                  <w:r>
+                    <w:rPr>
+                      <w:rFonts w:ascii="Arial" w:hAnsi="Arial" w:eastAsia="Arial"/>
+                      <w:b w:val="0"/>
+                      <w:sz w:val="12"/>
+                    </w:rPr>
+                    <w:t xml:space="preserve">{{hairstyle}} </w:t>
+                  </w:r>
+                  <w:r>
+                    <w:rPr>
+                      <w:rFonts w:ascii="Arial" w:hAnsi="Arial" w:eastAsia="Arial"/>
+                      <w:b w:val="0"/>
+                      <w:sz w:val="12"/>
+                    </w:rPr>
+                    <w:t>1. Peinado no acorde con las disposiciones institucionales.</w:t>
+                  </w:r>
+                </w:p>
+                <w:p>
+                  <w:pPr>
+                    <w:spacing w:before="0" w:after="0" w:line="240" w:lineRule="auto"/>
+                  </w:pPr>
+                  <w:r>
+                    <w:rPr>
+                      <w:rFonts w:ascii="Arial" w:hAnsi="Arial" w:eastAsia="Arial"/>
+                      <w:b w:val="0"/>
+                      <w:sz w:val="12"/>
+                    </w:rPr>
+                    <w:t xml:space="preserve">{{uniform}} </w:t>
+                  </w:r>
+                  <w:r>
+                    <w:rPr>
+                      <w:rFonts w:ascii="Arial" w:hAnsi="Arial" w:eastAsia="Arial"/>
+                      <w:b w:val="0"/>
+                      <w:sz w:val="12"/>
+                    </w:rPr>
+                    <w:t>2. Uso inadecuado o incompleto del uniforme.</w:t>
+                  </w:r>
+                </w:p>
+                <w:p>
+                  <w:pPr>
+                    <w:spacing w:before="0" w:after="0" w:line="240" w:lineRule="auto"/>
+                  </w:pPr>
+                  <w:r>
+                    <w:rPr>
+                      <w:rFonts w:ascii="Arial" w:hAnsi="Arial" w:eastAsia="Arial"/>
+                      <w:b w:val="0"/>
+                      <w:sz w:val="12"/>
+                    </w:rPr>
+                    <w:t xml:space="preserve">{{garment}} </w:t>
+                  </w:r>
+                  <w:r>
+                    <w:rPr>
+                      <w:rFonts w:ascii="Arial" w:hAnsi="Arial" w:eastAsia="Arial"/>
+                      <w:b w:val="0"/>
+                      <w:sz w:val="12"/>
+                    </w:rPr>
+                    <w:t>3. Prenda no correspondiente al uniforme institucional.</w:t>
+                  </w:r>
+                </w:p>
+                <w:p>
+                  <w:pPr>
+                    <w:spacing w:before="0" w:after="0" w:line="240" w:lineRule="auto"/>
+                  </w:pPr>
+                  <w:r>
+                    <w:rPr>
+                      <w:rFonts w:ascii="Arial" w:hAnsi="Arial" w:eastAsia="Arial"/>
+                      <w:b w:val="0"/>
+                      <w:sz w:val="12"/>
+                    </w:rPr>
+                    <w:t xml:space="preserve">{{late}} </w:t>
+                  </w:r>
+                  <w:r>
+                    <w:rPr>
+                      <w:rFonts w:ascii="Arial" w:hAnsi="Arial" w:eastAsia="Arial"/>
+                      <w:b w:val="0"/>
+                      <w:sz w:val="12"/>
+                    </w:rPr>
+                    <w:t>4. Tardanza en el ingreso</w:t>
+                  </w:r>
+                </w:p>
+                <w:p>
+                  <w:pPr>
+                    <w:spacing w:before="0" w:after="0" w:line="240" w:lineRule="auto"/>
+                  </w:pPr>
+                  <w:r>
+                    <w:rPr>
+                      <w:rFonts w:ascii="Arial" w:hAnsi="Arial" w:eastAsia="Arial"/>
+                      <w:b w:val="0"/>
+                      <w:sz w:val="12"/>
+                    </w:rPr>
+                    <w:t xml:space="preserve">{{conduct}} </w:t>
+                  </w:r>
+                  <w:r>
+                    <w:rPr>
+                      <w:rFonts w:ascii="Arial" w:hAnsi="Arial" w:eastAsia="Arial"/>
+                      <w:b w:val="0"/>
+                      <w:sz w:val="12"/>
+                    </w:rPr>
+                    <w:t>5. Conducta inapropiada</w:t>
+                  </w:r>
+                </w:p>
+              </w:tc>
+              <w:tc>
+                <w:tcPr>
+                  <w:tcW w:type="dxa" w:w="5782"/>
+                  <w:tcMar>
+                    <w:top w:w="45" w:type="dxa"/>
+                    <w:start w:w="73" w:type="dxa"/>
+                    <w:bottom w:w="28" w:type="dxa"/>
+                    <w:end w:w="73" w:type="dxa"/>
+                  </w:tcMar>
+                  <w:vAlign w:val="top"/>
+                </w:tcPr>
+                <w:p>
+                  <w:pPr>
+                    <w:spacing w:before="0" w:after="0" w:line="240" w:lineRule="auto"/>
+                  </w:pPr>
+                  <w:r>
+                    <w:rPr>
+                      <w:rFonts w:ascii="Arial" w:hAnsi="Arial" w:eastAsia="Arial"/>
+                      <w:b w:val="0"/>
+                      <w:sz w:val="12"/>
+                    </w:rPr>
+                  </w:r>
+                  <w:r>
+                    <w:rPr>
+                      <w:rFonts w:ascii="Arial" w:hAnsi="Arial" w:eastAsia="Arial"/>
+                      <w:b w:val="0"/>
+                      <w:sz w:val="12"/>
+                    </w:rPr>
+                    <w:t>DESCRIPCIÓN DE LA OBSERVACIÓN:</w:t>
+                  </w:r>
+                </w:p>
+                <w:p>
+                  <w:pPr>
+                    <w:spacing w:before="0" w:after="0" w:line="240" w:lineRule="auto"/>
+                  </w:pPr>
+                  <w:r>
+                    <w:rPr>
+                      <w:rFonts w:ascii="Arial" w:hAnsi="Arial" w:eastAsia="Arial"/>
+                      <w:b w:val="0"/>
+                      <w:sz w:val="12"/>
+                    </w:rPr>
+                    <w:t>{{observation}}</w:t>
+                  </w:r>
+                </w:p>
+              </w:tc>
+            </w:tr>
+          </w:tbl>
+          <w:p/>
+        </w:tc>
+      </w:tr>
+      <w:tr>
+        <w:trPr>
+          <w:trHeight w:val="454" w:hRule="exact"/>
+          <w:cantSplit/>
+        </w:trPr>
+        <w:tc>
+          <w:tcPr>
+            <w:tcW w:type="dxa" w:w="11452"/>
             <w:tcMar>
-              <w:top w:w="35" w:type="dxa"/>
-              <w:bottom w:w="35" w:type="dxa"/>
-              <w:start w:w="55" w:type="dxa"/>
-              <w:end w:w="55" w:type="dxa"/>
+              <w:top w:w="34" w:type="dxa"/>
+              <w:start w:w="68" w:type="dxa"/>
+              <w:bottom w:w="22" w:type="dxa"/>
+              <w:end w:w="68" w:type="dxa"/>
             </w:tcMar>
-            <w:tcBorders>
-              <w:left w:val="single" w:sz="3" w:color="B8B8B8"/>
-              <w:right w:val="single" w:sz="3" w:color="B8B8B8"/>
-              <w:top w:val="nil" w:sz="0" w:color="FFFFFF"/>
-              <w:bottom w:val="nil" w:sz="0" w:color="FFFFFF"/>
-            </w:tcBorders>
+            <w:vAlign w:val="center"/>
           </w:tcPr>
           <w:p>
             <w:pPr>
-              <w:spacing w:before="0" w:after="0" w:line="206" w:lineRule="auto"/>
-              <w:jc w:val="right"/>
+              <w:spacing w:before="0" w:after="0" w:line="240" w:lineRule="auto"/>
             </w:pPr>
-            <w:r/>
             <w:r>
               <w:rPr>
-                <w:rFonts w:ascii="Arial" w:hAnsi="Arial"/>
-                <w:b/>
-                <w:sz w:val="10"/>
+                <w:rFonts w:ascii="Arial" w:hAnsi="Arial" w:eastAsia="Arial"/>
+                <w:b w:val="0"/>
+                <w:sz w:val="12"/>
               </w:rPr>
-              <w:t>{{notificationLabel}} · {{date}}</w:t>
+            </w:r>
+            <w:r>
+              <w:rPr>
+                <w:rFonts w:ascii="Arial" w:hAnsi="Arial" w:eastAsia="Arial"/>
+                <w:b w:val="0"/>
+                <w:sz w:val="12"/>
+              </w:rPr>
+              <w:t>Recordamos que el adecuado cumplimiento de las normas institucionales contribuye al orden, la disciplina y la formación integral de nuestros estudiantes. Por ello, solicitamos a la familia brindar el acompañamiento necesario para garantizar el cumplimiento de estas disposiciones.</w:t>
             </w:r>
           </w:p>
         </w:tc>
       </w:tr>
       <w:tr>
         <w:trPr>
-          <w:trHeight w:val="340" w:hRule="atLeast"/>
+          <w:trHeight w:val="680" w:hRule="exact"/>
           <w:cantSplit/>
         </w:trPr>
         <w:tc>
           <w:tcPr>
-            <w:tcW w:type="dxa" w:w="5612"/>
-            <w:gridSpan w:val="2"/>
+            <w:tcW w:type="dxa" w:w="11452"/>
+            <w:tcMar>
+              <w:top w:w="34" w:type="dxa"/>
+              <w:start w:w="68" w:type="dxa"/>
+              <w:bottom w:w="22" w:type="dxa"/>
+              <w:end w:w="68" w:type="dxa"/>
+            </w:tcMar>
             <w:vAlign w:val="center"/>
-            <w:tcMar>
-              <w:top w:w="35" w:type="dxa"/>
-              <w:bottom w:w="35" w:type="dxa"/>
-              <w:start w:w="55" w:type="dxa"/>
-              <w:end w:w="55" w:type="dxa"/>
-            </w:tcMar>
-            <w:tcBorders>
-              <w:left w:val="single" w:sz="3" w:color="B8B8B8"/>
-              <w:right w:val="nil" w:sz="0" w:color="FFFFFF"/>
-              <w:top w:val="nil" w:sz="0" w:color="FFFFFF"/>
-              <w:bottom w:val="nil" w:sz="0" w:color="FFFFFF"/>
-            </w:tcBorders>
           </w:tcPr>
           <w:p>
             <w:pPr>
-              <w:spacing w:before="0" w:after="0" w:line="206" w:lineRule="auto"/>
+              <w:spacing w:before="0" w:after="0" w:line="240" w:lineRule="auto"/>
             </w:pPr>
-            <w:r/>
             <w:r>
               <w:rPr>
-                <w:rFonts w:ascii="Arial" w:hAnsi="Arial"/>
-                <w:b/>
+                <w:rFonts w:ascii="Arial" w:hAnsi="Arial" w:eastAsia="Arial"/>
+                <w:b w:val="0"/>
                 <w:sz w:val="12"/>
               </w:rPr>
-              <w:t xml:space="preserve">Estudiante: </w:t>
             </w:r>
             <w:r>
               <w:rPr>
-                <w:rFonts w:ascii="Arial" w:hAnsi="Arial"/>
+                <w:rFonts w:ascii="Arial" w:hAnsi="Arial" w:eastAsia="Arial"/>
                 <w:b w:val="0"/>
                 <w:sz w:val="12"/>
               </w:rPr>
-              <w:t>{{studentName}}</w:t>
+              <w:t>COMPROMISO Y SEGUIMIENTO</w:t>
             </w:r>
           </w:p>
-        </w:tc>
-        <w:tc>
-          <w:tcPr>
-            <w:tcW w:type="dxa" w:w="5612"/>
-            <w:gridSpan w:val="2"/>
-            <w:vAlign w:val="center"/>
-            <w:tcMar>
-              <w:top w:w="35" w:type="dxa"/>
-              <w:bottom w:w="35" w:type="dxa"/>
-              <w:start w:w="55" w:type="dxa"/>
-              <w:end w:w="55" w:type="dxa"/>
-            </w:tcMar>
-            <w:tcBorders>
-              <w:left w:val="nil" w:sz="0" w:color="FFFFFF"/>
-              <w:right w:val="single" w:sz="3" w:color="B8B8B8"/>
-              <w:top w:val="nil" w:sz="0" w:color="FFFFFF"/>
-              <w:bottom w:val="nil" w:sz="0" w:color="FFFFFF"/>
-            </w:tcBorders>
-          </w:tcPr>
           <w:p>
             <w:pPr>
-              <w:spacing w:before="0" w:after="0" w:line="206" w:lineRule="auto"/>
+              <w:spacing w:before="0" w:after="0" w:line="240" w:lineRule="auto"/>
             </w:pPr>
-            <w:r/>
             <w:r>
               <w:rPr>
-                <w:rFonts w:ascii="Arial" w:hAnsi="Arial"/>
-                <w:b/>
-                <w:sz w:val="12"/>
-              </w:rPr>
-              <w:t xml:space="preserve">Grado: </w:t>
-            </w:r>
-            <w:r>
-              <w:rPr>
-                <w:rFonts w:ascii="Arial" w:hAnsi="Arial"/>
+                <w:rFonts w:ascii="Arial" w:hAnsi="Arial" w:eastAsia="Arial"/>
                 <w:b w:val="0"/>
                 <w:sz w:val="12"/>
               </w:rPr>
-              <w:t>{{gradeSection}}</w:t>
+              <w:t>La presente notificación deberá ser firmada por el padre, madre o apoderado y devuelta por el estudiante al día siguiente de su entrega, como constancia de haber tomado conocimiento de la situación comunicada. Se dispone que ante la reiteración de la situación (tercera notificación realizada) se realizará un llamado formal al padre, madre o apoderado para una reunión en la Dirección de la institución, con la finalidad de abordar el comportamiento y cumplimiento de las normas institucionales por parte del estudiante y establecer los compromisos correspondientes.</w:t>
             </w:r>
           </w:p>
         </w:tc>
       </w:tr>
       <w:tr>
         <w:trPr>
-          <w:trHeight w:val="340" w:hRule="atLeast"/>
+          <w:trHeight w:val="850" w:hRule="exact"/>
           <w:cantSplit/>
         </w:trPr>
         <w:tc>
           <w:tcPr>
-            <w:tcW w:type="dxa" w:w="5612"/>
-            <w:gridSpan w:val="2"/>
+            <w:tcW w:type="dxa" w:w="11452"/>
+            <w:tcMar>
+              <w:top w:w="34" w:type="dxa"/>
+              <w:start w:w="68" w:type="dxa"/>
+              <w:bottom w:w="22" w:type="dxa"/>
+              <w:end w:w="68" w:type="dxa"/>
+            </w:tcMar>
             <w:vAlign w:val="center"/>
-            <w:tcMar>
-              <w:top w:w="35" w:type="dxa"/>
-              <w:bottom w:w="35" w:type="dxa"/>
-              <w:start w:w="55" w:type="dxa"/>
-              <w:end w:w="55" w:type="dxa"/>
-            </w:tcMar>
-            <w:tcBorders>
-              <w:left w:val="single" w:sz="3" w:color="B8B8B8"/>
-              <w:right w:val="nil" w:sz="0" w:color="FFFFFF"/>
-              <w:top w:val="nil" w:sz="0" w:color="FFFFFF"/>
-              <w:bottom w:val="nil" w:sz="0" w:color="FFFFFF"/>
-            </w:tcBorders>
           </w:tcPr>
           <w:p>
             <w:pPr>
-              <w:spacing w:before="0" w:after="0" w:line="206" w:lineRule="auto"/>
+              <w:spacing w:before="0" w:after="0" w:line="240" w:lineRule="auto"/>
             </w:pPr>
-            <w:r/>
             <w:r>
               <w:rPr>
-                <w:rFonts w:ascii="Arial" w:hAnsi="Arial"/>
-                <w:b/>
-                <w:sz w:val="11"/>
+                <w:rFonts w:ascii="Arial" w:hAnsi="Arial" w:eastAsia="Arial"/>
+                <w:b w:val="0"/>
+                <w:sz w:val="12"/>
               </w:rPr>
-              <w:t xml:space="preserve">Tutor(a): </w:t>
             </w:r>
             <w:r>
               <w:rPr>
-                <w:rFonts w:ascii="Arial" w:hAnsi="Arial"/>
+                <w:rFonts w:ascii="Arial" w:hAnsi="Arial" w:eastAsia="Arial"/>
                 <w:b w:val="0"/>
-                <w:sz w:val="11"/>
+                <w:sz w:val="12"/>
               </w:rPr>
-              <w:t>{{tutorName}}</w:t>
+              <w:t>CONSTANCIA DE RECEPCIÓN</w:t>
             </w:r>
           </w:p>
-        </w:tc>
-        <w:tc>
-          <w:tcPr>
-            <w:tcW w:type="dxa" w:w="5612"/>
-            <w:gridSpan w:val="2"/>
-            <w:vAlign w:val="center"/>
-            <w:tcMar>
-              <w:top w:w="35" w:type="dxa"/>
-              <w:bottom w:w="35" w:type="dxa"/>
-              <w:start w:w="55" w:type="dxa"/>
-              <w:end w:w="55" w:type="dxa"/>
-            </w:tcMar>
-            <w:tcBorders>
-              <w:left w:val="nil" w:sz="0" w:color="FFFFFF"/>
-              <w:right w:val="single" w:sz="3" w:color="B8B8B8"/>
-              <w:top w:val="nil" w:sz="0" w:color="FFFFFF"/>
-              <w:bottom w:val="nil" w:sz="0" w:color="FFFFFF"/>
-            </w:tcBorders>
-          </w:tcPr>
           <w:p>
             <w:pPr>
-              <w:spacing w:before="0" w:after="0" w:line="206" w:lineRule="auto"/>
+              <w:spacing w:before="0" w:after="0" w:line="240" w:lineRule="auto"/>
             </w:pPr>
-            <w:r/>
             <w:r>
               <w:rPr>
-                <w:rFonts w:ascii="Arial" w:hAnsi="Arial"/>
-                <w:b/>
-                <w:sz w:val="11"/>
+                <w:rFonts w:ascii="Arial" w:hAnsi="Arial" w:eastAsia="Arial"/>
+                <w:b w:val="0"/>
+                <w:sz w:val="12"/>
               </w:rPr>
-              <w:t xml:space="preserve">Apoderado: </w:t>
+              <w:t xml:space="preserve">Yo, </w:t>
             </w:r>
             <w:r>
               <w:rPr>
-                <w:rFonts w:ascii="Arial" w:hAnsi="Arial"/>
+                <w:rFonts w:ascii="Arial" w:hAnsi="Arial" w:eastAsia="Arial"/>
                 <w:b w:val="0"/>
-                <w:sz w:val="11"/>
+                <w:sz w:val="12"/>
               </w:rPr>
               <w:t>{{guardianName}}</w:t>
             </w:r>
             <w:r>
               <w:rPr>
-                <w:rFonts w:ascii="Arial" w:hAnsi="Arial"/>
-                <w:b/>
-                <w:sz w:val="11"/>
+                <w:rFonts w:ascii="Arial" w:hAnsi="Arial" w:eastAsia="Arial"/>
+                <w:b w:val="0"/>
+                <w:sz w:val="12"/>
               </w:rPr>
-              <w:t xml:space="preserve">   DNI: </w:t>
+              <w:t>, padre, madre o apoderado(a) del estudiante, declaro haber tomado conocimiento de la presente notificación y me comprometo a brindar el acompañamiento necesario para el cumplimiento de las disposiciones institucionales.</w:t>
+            </w:r>
+          </w:p>
+          <w:p>
+            <w:pPr>
+              <w:spacing w:before="0" w:after="0" w:line="240" w:lineRule="auto"/>
+            </w:pPr>
+            <w:r>
+              <w:rPr>
+                <w:rFonts w:ascii="Arial" w:hAnsi="Arial" w:eastAsia="Arial"/>
+                <w:b w:val="0"/>
+                <w:sz w:val="12"/>
+              </w:rPr>
+              <w:t xml:space="preserve">FIRMA DEL PADRE/MADRE/APODERADO: _______________________   DNI: </w:t>
             </w:r>
             <w:r>
               <w:rPr>
-                <w:rFonts w:ascii="Arial" w:hAnsi="Arial"/>
+                <w:rFonts w:ascii="Arial" w:hAnsi="Arial" w:eastAsia="Arial"/>
                 <w:b w:val="0"/>
-                <w:sz w:val="11"/>
+                <w:sz w:val="12"/>
               </w:rPr>
               <w:t>{{guardianDni}}</w:t>
             </w:r>
+            <w:r>
+              <w:rPr>
+                <w:rFonts w:ascii="Arial" w:hAnsi="Arial" w:eastAsia="Arial"/>
+                <w:b w:val="0"/>
+                <w:sz w:val="12"/>
+              </w:rPr>
+              <w:t xml:space="preserve">   FECHA: ____ / ____ / ______</w:t>
+            </w:r>
           </w:p>
-        </w:tc>
-      </w:tr>
-      <w:tr>
-        <w:trPr>
-          <w:trHeight w:val="453" w:hRule="atLeast"/>
-          <w:cantSplit/>
-        </w:trPr>
-        <w:tc>
-          <w:tcPr>
-            <w:tcW w:type="dxa" w:w="11224"/>
-            <w:gridSpan w:val="4"/>
-            <w:vAlign w:val="center"/>
-            <w:tcMar>
-              <w:top w:w="35" w:type="dxa"/>
-              <w:bottom w:w="35" w:type="dxa"/>
-              <w:start w:w="55" w:type="dxa"/>
-              <w:end w:w="55" w:type="dxa"/>
-            </w:tcMar>
-            <w:tcBorders>
-              <w:left w:val="single" w:sz="3" w:color="B8B8B8"/>
-              <w:right w:val="single" w:sz="3" w:color="B8B8B8"/>
-              <w:top w:val="single" w:sz="3" w:color="D2D2D2"/>
-              <w:bottom w:val="nil" w:sz="0" w:color="FFFFFF"/>
-            </w:tcBorders>
-          </w:tcPr>
           <w:p>
             <w:pPr>
-              <w:spacing w:before="0" w:after="0" w:line="206" w:lineRule="auto"/>
+              <w:spacing w:before="0" w:after="0" w:line="240" w:lineRule="auto"/>
+              <w:jc w:val="center"/>
             </w:pPr>
-            <w:r/>
             <w:r>
               <w:rPr>
-                <w:rFonts w:ascii="Arial" w:hAnsi="Arial"/>
-                <w:b/>
-                <w:sz w:val="13"/>
+                <w:rFonts w:ascii="Arial" w:hAnsi="Arial" w:eastAsia="Arial"/>
+                <w:b w:val="0"/>
+                <w:sz w:val="12"/>
               </w:rPr>
-              <w:t>PRESENTACIÓN PERSONAL</w:t>
-            </w:r>
-            <w:r>
-              <w:br/>
-            </w:r>
-            <w:r>
-              <w:rPr>
-                <w:rFonts w:ascii="Arial" w:hAnsi="Arial"/>
-                <w:b w:val="0"/>
-                <w:sz w:val="10"/>
-              </w:rPr>
-              <w:t>Se comunica el incumplimiento de las disposiciones institucionales de presentación personal:</w:t>
-            </w:r>
-          </w:p>
-        </w:tc>
-      </w:tr>
-      <w:tr>
-        <w:trPr>
-          <w:trHeight w:val="396" w:hRule="atLeast"/>
-          <w:cantSplit/>
-        </w:trPr>
-        <w:tc>
-          <w:tcPr>
-            <w:tcW w:type="dxa" w:w="5612"/>
-            <w:gridSpan w:val="2"/>
-            <w:vAlign w:val="center"/>
-            <w:tcMar>
-              <w:top w:w="35" w:type="dxa"/>
-              <w:bottom w:w="35" w:type="dxa"/>
-              <w:start w:w="55" w:type="dxa"/>
-              <w:end w:w="55" w:type="dxa"/>
-            </w:tcMar>
-            <w:tcBorders>
-              <w:left w:val="single" w:sz="3" w:color="B8B8B8"/>
-              <w:right w:val="nil" w:sz="0" w:color="FFFFFF"/>
-              <w:top w:val="nil" w:sz="0" w:color="FFFFFF"/>
-              <w:bottom w:val="nil" w:sz="0" w:color="FFFFFF"/>
-            </w:tcBorders>
-          </w:tcPr>
-          <w:p>
-            <w:pPr>
-              <w:spacing w:before="0" w:after="0" w:line="206" w:lineRule="auto"/>
-            </w:pPr>
-            <w:r/>
-            <w:r>
-              <w:rPr>
-                <w:rFonts w:ascii="Arial" w:hAnsi="Arial"/>
-                <w:b/>
-                <w:sz w:val="11"/>
-              </w:rPr>
-              <w:t xml:space="preserve">{{hairstyle}} </w:t>
-            </w:r>
-            <w:r>
-              <w:rPr>
-                <w:rFonts w:ascii="Arial" w:hAnsi="Arial"/>
-                <w:b w:val="0"/>
-                <w:sz w:val="11"/>
-              </w:rPr>
-              <w:t>1. Peinado no acorde con las disposiciones institucionales.</w:t>
-            </w:r>
-          </w:p>
-        </w:tc>
-        <w:tc>
-          <w:tcPr>
-            <w:tcW w:type="dxa" w:w="5612"/>
-            <w:gridSpan w:val="2"/>
-            <w:vAlign w:val="center"/>
-            <w:tcMar>
-              <w:top w:w="35" w:type="dxa"/>
-              <w:bottom w:w="35" w:type="dxa"/>
-              <w:start w:w="55" w:type="dxa"/>
-              <w:end w:w="55" w:type="dxa"/>
-            </w:tcMar>
-            <w:tcBorders>
-              <w:left w:val="nil" w:sz="0" w:color="FFFFFF"/>
-              <w:right w:val="single" w:sz="3" w:color="B8B8B8"/>
-              <w:top w:val="nil" w:sz="0" w:color="FFFFFF"/>
-              <w:bottom w:val="nil" w:sz="0" w:color="FFFFFF"/>
-            </w:tcBorders>
-          </w:tcPr>
-          <w:p>
-            <w:pPr>
-              <w:spacing w:before="0" w:after="0" w:line="206" w:lineRule="auto"/>
-            </w:pPr>
-            <w:r/>
-            <w:r>
-              <w:rPr>
-                <w:rFonts w:ascii="Arial" w:hAnsi="Arial"/>
-                <w:b/>
-                <w:sz w:val="11"/>
-              </w:rPr>
-              <w:t xml:space="preserve">{{uniform}} </w:t>
-            </w:r>
-            <w:r>
-              <w:rPr>
-                <w:rFonts w:ascii="Arial" w:hAnsi="Arial"/>
-                <w:b w:val="0"/>
-                <w:sz w:val="11"/>
-              </w:rPr>
-              <w:t>2. Uso inadecuado o incompleto del uniforme.</w:t>
-            </w:r>
-          </w:p>
-        </w:tc>
-      </w:tr>
-      <w:tr>
-        <w:trPr>
-          <w:trHeight w:val="396" w:hRule="atLeast"/>
-          <w:cantSplit/>
-        </w:trPr>
-        <w:tc>
-          <w:tcPr>
-            <w:tcW w:type="dxa" w:w="5612"/>
-            <w:gridSpan w:val="2"/>
-            <w:vAlign w:val="center"/>
-            <w:tcMar>
-              <w:top w:w="35" w:type="dxa"/>
-              <w:bottom w:w="35" w:type="dxa"/>
-              <w:start w:w="55" w:type="dxa"/>
-              <w:end w:w="55" w:type="dxa"/>
-            </w:tcMar>
-            <w:tcBorders>
-              <w:left w:val="single" w:sz="3" w:color="B8B8B8"/>
-              <w:right w:val="nil" w:sz="0" w:color="FFFFFF"/>
-              <w:top w:val="nil" w:sz="0" w:color="FFFFFF"/>
-              <w:bottom w:val="nil" w:sz="0" w:color="FFFFFF"/>
-            </w:tcBorders>
-          </w:tcPr>
-          <w:p>
-            <w:pPr>
-              <w:spacing w:before="0" w:after="0" w:line="206" w:lineRule="auto"/>
-            </w:pPr>
-            <w:r/>
-            <w:r>
-              <w:rPr>
-                <w:rFonts w:ascii="Arial" w:hAnsi="Arial"/>
-                <w:b/>
-                <w:sz w:val="11"/>
-              </w:rPr>
-              <w:t xml:space="preserve">{{garment}} </w:t>
-            </w:r>
-            <w:r>
-              <w:rPr>
-                <w:rFonts w:ascii="Arial" w:hAnsi="Arial"/>
-                <w:b w:val="0"/>
-                <w:sz w:val="11"/>
-              </w:rPr>
-              <w:t>3. Prenda no correspondiente al uniforme institucional.</w:t>
-            </w:r>
-          </w:p>
-        </w:tc>
-        <w:tc>
-          <w:tcPr>
-            <w:tcW w:type="dxa" w:w="5612"/>
-            <w:gridSpan w:val="2"/>
-            <w:vAlign w:val="center"/>
-            <w:tcMar>
-              <w:top w:w="35" w:type="dxa"/>
-              <w:bottom w:w="35" w:type="dxa"/>
-              <w:start w:w="55" w:type="dxa"/>
-              <w:end w:w="55" w:type="dxa"/>
-            </w:tcMar>
-            <w:tcBorders>
-              <w:left w:val="nil" w:sz="0" w:color="FFFFFF"/>
-              <w:right w:val="single" w:sz="3" w:color="B8B8B8"/>
-              <w:top w:val="nil" w:sz="0" w:color="FFFFFF"/>
-              <w:bottom w:val="nil" w:sz="0" w:color="FFFFFF"/>
-            </w:tcBorders>
-          </w:tcPr>
-          <w:p>
-            <w:pPr>
-              <w:spacing w:before="0" w:after="0" w:line="206" w:lineRule="auto"/>
-            </w:pPr>
-            <w:r/>
-            <w:r>
-              <w:rPr>
-                <w:rFonts w:ascii="Arial" w:hAnsi="Arial"/>
-                <w:b/>
-                <w:sz w:val="11"/>
-              </w:rPr>
-              <w:t xml:space="preserve">{{other}} </w:t>
-            </w:r>
-            <w:r>
-              <w:rPr>
-                <w:rFonts w:ascii="Arial" w:hAnsi="Arial"/>
-                <w:b w:val="0"/>
-                <w:sz w:val="11"/>
-              </w:rPr>
-              <w:t>4. Otro</w:t>
-            </w:r>
-          </w:p>
-        </w:tc>
-      </w:tr>
-      <w:tr>
-        <w:trPr>
-          <w:trHeight w:val="453" w:hRule="atLeast"/>
-          <w:cantSplit/>
-        </w:trPr>
-        <w:tc>
-          <w:tcPr>
-            <w:tcW w:type="dxa" w:w="11224"/>
-            <w:gridSpan w:val="4"/>
-            <w:vAlign w:val="center"/>
-            <w:tcMar>
-              <w:top w:w="35" w:type="dxa"/>
-              <w:bottom w:w="35" w:type="dxa"/>
-              <w:start w:w="55" w:type="dxa"/>
-              <w:end w:w="55" w:type="dxa"/>
-            </w:tcMar>
-            <w:tcBorders>
-              <w:left w:val="single" w:sz="3" w:color="B8B8B8"/>
-              <w:right w:val="single" w:sz="3" w:color="B8B8B8"/>
-              <w:top w:val="nil" w:sz="0" w:color="FFFFFF"/>
-              <w:bottom w:val="nil" w:sz="0" w:color="FFFFFF"/>
-            </w:tcBorders>
-          </w:tcPr>
-          <w:p>
-            <w:pPr>
-              <w:spacing w:before="0" w:after="0" w:line="206" w:lineRule="auto"/>
-            </w:pPr>
-            <w:r/>
-            <w:r>
-              <w:rPr>
-                <w:rFonts w:ascii="Arial" w:hAnsi="Arial"/>
-                <w:b/>
-                <w:sz w:val="11"/>
-              </w:rPr>
-              <w:t xml:space="preserve">Observación: </w:t>
-            </w:r>
-            <w:r>
-              <w:rPr>
-                <w:rFonts w:ascii="Arial" w:hAnsi="Arial"/>
-                <w:b w:val="0"/>
-                <w:sz w:val="11"/>
-              </w:rPr>
-              <w:t>{{observation}}</w:t>
-            </w:r>
-          </w:p>
-        </w:tc>
-      </w:tr>
-      <w:tr>
-        <w:trPr>
-          <w:trHeight w:val="737" w:hRule="atLeast"/>
-          <w:cantSplit/>
-        </w:trPr>
-        <w:tc>
-          <w:tcPr>
-            <w:tcW w:type="dxa" w:w="11224"/>
-            <w:gridSpan w:val="4"/>
-            <w:vAlign w:val="center"/>
-            <w:tcMar>
-              <w:top w:w="35" w:type="dxa"/>
-              <w:bottom w:w="35" w:type="dxa"/>
-              <w:start w:w="55" w:type="dxa"/>
-              <w:end w:w="55" w:type="dxa"/>
-            </w:tcMar>
-            <w:tcBorders>
-              <w:left w:val="single" w:sz="3" w:color="B8B8B8"/>
-              <w:right w:val="single" w:sz="3" w:color="B8B8B8"/>
-              <w:top w:val="single" w:sz="3" w:color="D2D2D2"/>
-              <w:bottom w:val="nil" w:sz="0" w:color="FFFFFF"/>
-            </w:tcBorders>
-          </w:tcPr>
-          <w:p>
-            <w:pPr>
-              <w:spacing w:before="0" w:after="0" w:line="206" w:lineRule="auto"/>
-            </w:pPr>
-            <w:r/>
-            <w:r>
-              <w:rPr>
-                <w:rFonts w:ascii="Arial" w:hAnsi="Arial"/>
-                <w:b/>
-                <w:sz w:val="13"/>
-              </w:rPr>
-              <w:t>COMPROMISO Y SEGUIMIENTO</w:t>
-            </w:r>
-            <w:r>
-              <w:br/>
-            </w:r>
-            <w:r>
-              <w:rPr>
-                <w:rFonts w:ascii="Arial" w:hAnsi="Arial"/>
-                <w:b w:val="0"/>
-                <w:sz w:val="10"/>
-              </w:rPr>
-              <w:t>1. Primera: comunicación del incumplimiento.   2. Segunda: reiteración y acompañamiento familiar.</w:t>
-            </w:r>
-            <w:r>
-              <w:br/>
-            </w:r>
-            <w:r>
-              <w:rPr>
-                <w:rFonts w:ascii="Arial" w:hAnsi="Arial"/>
-                <w:b/>
-                <w:sz w:val="10"/>
-              </w:rPr>
-              <w:t>3. Tercera: citación formal a Dirección.   IMPORTANTE: devolver firmada al día siguiente.</w:t>
-            </w:r>
-          </w:p>
-        </w:tc>
-      </w:tr>
-      <w:tr>
-        <w:trPr>
-          <w:trHeight w:val="1020" w:hRule="atLeast"/>
-          <w:cantSplit/>
-        </w:trPr>
-        <w:tc>
-          <w:tcPr>
-            <w:tcW w:type="dxa" w:w="11224"/>
-            <w:gridSpan w:val="4"/>
-            <w:vAlign w:val="center"/>
-            <w:tcMar>
-              <w:top w:w="35" w:type="dxa"/>
-              <w:bottom w:w="35" w:type="dxa"/>
-              <w:start w:w="55" w:type="dxa"/>
-              <w:end w:w="55" w:type="dxa"/>
-            </w:tcMar>
-            <w:tcBorders>
-              <w:left w:val="single" w:sz="3" w:color="B8B8B8"/>
-              <w:right w:val="single" w:sz="3" w:color="B8B8B8"/>
-              <w:top w:val="single" w:sz="3" w:color="D2D2D2"/>
-              <w:bottom w:val="single" w:sz="3" w:color="B8B8B8"/>
-            </w:tcBorders>
-          </w:tcPr>
-          <w:p>
-            <w:pPr>
-              <w:spacing w:before="0" w:after="0" w:line="206" w:lineRule="auto"/>
-            </w:pPr>
-            <w:r/>
-            <w:r>
-              <w:rPr>
-                <w:rFonts w:ascii="Arial" w:hAnsi="Arial"/>
-                <w:b/>
-                <w:sz w:val="13"/>
-              </w:rPr>
-              <w:t>CONSTANCIA DE RECEPCIÓN</w:t>
-            </w:r>
-            <w:r>
-              <w:br/>
-            </w:r>
-            <w:r>
-              <w:rPr>
-                <w:rFonts w:ascii="Arial" w:hAnsi="Arial"/>
-                <w:b w:val="0"/>
-                <w:sz w:val="10"/>
-              </w:rPr>
-              <w:t>Yo, {{guardianName}}, declaro haber tomado conocimiento de la presente notificación.</w:t>
-            </w:r>
-            <w:r>
-              <w:br/>
-            </w:r>
-            <w:r>
-              <w:rPr>
-                <w:rFonts w:ascii="Arial" w:hAnsi="Arial"/>
-                <w:b w:val="0"/>
-                <w:sz w:val="10"/>
-              </w:rPr>
-              <w:t>Firma padre/madre/apoderado: ____________________   DNI: {{guardianDni}}   Fecha: ____/____/______</w:t>
-            </w:r>
-            <w:r>
-              <w:br/>
-            </w:r>
-            <w:r>
-              <w:rPr>
-                <w:rFonts w:ascii="Arial" w:hAnsi="Arial"/>
-                <w:b w:val="0"/>
-                <w:sz w:val="10"/>
-              </w:rPr>
-              <w:t>Firma docente/tutor: ______________________________</w:t>
+              <w:t>FIRMA DEL AUXILIAR/TUTOR/DOCENTE A CARGO: __________________________________________</w:t>
             </w:r>
           </w:p>
         </w:tc>
       </w:tr>
     </w:tbl>
-    <w:p>
-      <w:pPr>
-        <w:spacing w:before="0" w:after="0" w:line="48" w:lineRule="auto"/>
-        <w:pBdr>
-          <w:bottom w:val="dashed" w:sz="4" w:color="999999"/>
-        </w:pBdr>
-      </w:pPr>
-    </w:p>
     <w:sectPr>
-      <w:pgSz w:w="11906" w:h="16838"/>
-      <w:pgMar w:top="57" w:right="283" w:bottom="57" w:left="283" w:header="0" w:footer="0" w:gutter="0"/>
+      <w:pgSz w:w="11906" w:h="5613" w:orient="landscape"/>
+      <w:pgMar w:top="170" w:right="227" w:bottom="170" w:left="227" w:header="0" w:footer="0" w:gutter="0"/>
       <w:cols w:space="720"/>
       <w:docGrid w:linePitch="360"/>
     </w:sectPr>
@@ -1110,7 +1098,7 @@
     <w:qFormat/>
     <w:rsid w:val="00FC693F"/>
     <w:pPr>
-      <w:spacing w:after="0" w:before="0"/>
+      <w:spacing w:before="0" w:after="0"/>
     </w:pPr>
     <w:rPr>
       <w:rFonts w:ascii="Arial" w:hAnsi="Arial"/>

</xml_diff>